<commit_message>
delay.tex: van Ede citation, reference to Fig. 2A, MBL wording; note of changes since v5
delay.tex: Introduction cites van Ede & Nobre (2023); Results refer to Fig. 2A for PMT
and MT; MBL in the stimulus-onset window "built up toward stronger effector-selective
preparation"; word counts of introduction and discussion updated.
response_letter.md and .docx: the two corresponding internal notes removed.
changes_since_v5.md and .docx: list of the changes made since v5.

Co-Authored-By: Claude Opus 5.5 <noreply@anthropic.com>
Claude-Session: https://claude.ai/code/session_01LeuKvWoyHgd8kHiMRFUzm4
</commit_message>
<xml_diff>
--- a/manuscript/response_letter.docx
+++ b/manuscript/response_letter.docx
@@ -81,13 +81,13 @@
           <w:bCs/>
           <w:b/>
         </w:rPr>
-        <w:t xml:space="preserve">Éditeur (van Ede)</w:t>
-      </w:r>
-      <w:r>
-        <w:t xml:space="preserve"> </w:t>
-      </w:r>
-      <w:r>
-        <w:t xml:space="preserve">: la v5 a retiré de l’Introduction la citation de van Ede &amp; Nobre (2023). La réponse à la note éditoriale suppose qu’elle est rétablie. À rétablir dans le manuscrit, ou à changer dans la lettre.</w:t>
+        <w:t xml:space="preserve">C2.4 (« second accumulation phase »)</w:t>
+      </w:r>
+      <w:r>
+        <w:t xml:space="preserve"> </w:t>
+      </w:r>
+      <w:r>
+        <w:t xml:space="preserve">: réponse inchangée sur le fond (on garde le nom), à relire.</w:t>
       </w:r>
     </w:p>
     <w:p>
@@ -103,13 +103,13 @@
           <w:bCs/>
           <w:b/>
         </w:rPr>
-        <w:t xml:space="preserve">C1.6 (renvoi à la Figure 2)</w:t>
-      </w:r>
-      <w:r>
-        <w:t xml:space="preserve"> </w:t>
-      </w:r>
-      <w:r>
-        <w:t xml:space="preserve">: les Results ne renvoient plus à la Figure 2 pour définir PMT et MT. La réponse suppose que le renvoi est rétabli.</w:t>
+        <w:t xml:space="preserve">C2.7 (autres formats sensoriels)</w:t>
+      </w:r>
+      <w:r>
+        <w:t xml:space="preserve"> </w:t>
+      </w:r>
+      <w:r>
+        <w:t xml:space="preserve">: traitement partiel, comme avant.</w:t>
       </w:r>
     </w:p>
     <w:p>
@@ -125,13 +125,13 @@
           <w:bCs/>
           <w:b/>
         </w:rPr>
-        <w:t xml:space="preserve">C2.4 (« second accumulation phase »)</w:t>
-      </w:r>
-      <w:r>
-        <w:t xml:space="preserve"> </w:t>
-      </w:r>
-      <w:r>
-        <w:t xml:space="preserve">: réponse inchangée sur le fond (on garde le nom), à relire.</w:t>
+        <w:t xml:space="preserve">C1.7 (α fonction du délai)</w:t>
+      </w:r>
+      <w:r>
+        <w:t xml:space="preserve"> </w:t>
+      </w:r>
+      <w:r>
+        <w:t xml:space="preserve">: comme avant.</w:t>
       </w:r>
     </w:p>
     <w:p>
@@ -147,13 +147,13 @@
           <w:bCs/>
           <w:b/>
         </w:rPr>
-        <w:t xml:space="preserve">C2.7 (autres formats sensoriels)</w:t>
-      </w:r>
-      <w:r>
-        <w:t xml:space="preserve"> </w:t>
-      </w:r>
-      <w:r>
-        <w:t xml:space="preserve">: traitement partiel, comme avant.</w:t>
+        <w:t xml:space="preserve">Plages de r et g</w:t>
+      </w:r>
+      <w:r>
+        <w:t xml:space="preserve"> </w:t>
+      </w:r>
+      <w:r>
+        <w:t xml:space="preserve">: le texte dit que g est échantillonné au-dessus de l’estimation de Dendauw et al. (2024). Les valeurs de r et g de Dendauw et al. n’ont pas été vérifiées.</w:t>
       </w:r>
     </w:p>
     <w:p>
@@ -169,50 +169,6 @@
           <w:bCs/>
           <w:b/>
         </w:rPr>
-        <w:t xml:space="preserve">C1.7 (α fonction du délai)</w:t>
-      </w:r>
-      <w:r>
-        <w:t xml:space="preserve"> </w:t>
-      </w:r>
-      <w:r>
-        <w:t xml:space="preserve">: comme avant.</w:t>
-      </w:r>
-    </w:p>
-    <w:p>
-      <w:pPr>
-        <w:numPr>
-          <w:ilvl w:val="0"/>
-          <w:numId w:val="1001"/>
-        </w:numPr>
-        <w:pStyle w:val="Compact"/>
-      </w:pPr>
-      <w:r>
-        <w:rPr>
-          <w:bCs/>
-          <w:b/>
-        </w:rPr>
-        <w:t xml:space="preserve">Plages de r et g</w:t>
-      </w:r>
-      <w:r>
-        <w:t xml:space="preserve"> </w:t>
-      </w:r>
-      <w:r>
-        <w:t xml:space="preserve">: le texte dit que g est échantillonné au-dessus de l’estimation de Dendauw et al. (2024). Les valeurs de r et g de Dendauw et al. n’ont pas été vérifiées.</w:t>
-      </w:r>
-    </w:p>
-    <w:p>
-      <w:pPr>
-        <w:numPr>
-          <w:ilvl w:val="0"/>
-          <w:numId w:val="1001"/>
-        </w:numPr>
-        <w:pStyle w:val="Compact"/>
-      </w:pPr>
-      <w:r>
-        <w:rPr>
-          <w:bCs/>
-          <w:b/>
-        </w:rPr>
         <w:t xml:space="preserve">Archive OSF</w:t>
       </w:r>
       <w:r>
@@ -957,14 +913,6 @@
         <w:t xml:space="preserve">&gt; Empirical results.</w:t>
       </w:r>
     </w:p>
-    <w:p>
-      <w:pPr>
-        <w:pStyle w:val="BlockText"/>
-      </w:pPr>
-      <w:r>
-        <w:t xml:space="preserve">[NOTE INTERNE — ne pas envoyer telle quelle] Le renvoi à la Figure 2A dans les Results est à rétablir dans le manuscrit (voir « Note pour les auteurs »).</w:t>
-      </w:r>
-    </w:p>
     <w:bookmarkEnd w:id="27"/>
     <w:bookmarkStart w:id="28" w:name="c1.7-different-delays-to-show-build-up."/>
     <w:p>
@@ -2086,14 +2034,6 @@
       </w:r>
       <w:r>
         <w:t xml:space="preserve">: Introduction, third paragraph.</w:t>
-      </w:r>
-    </w:p>
-    <w:p>
-      <w:pPr>
-        <w:pStyle w:val="BlockText"/>
-      </w:pPr>
-      <w:r>
-        <w:t xml:space="preserve">[NOTE INTERNE — ne pas envoyer telle quelle] La citation est à rétablir dans le manuscrit (voir « Note pour les auteurs »).</w:t>
       </w:r>
     </w:p>
     <w:bookmarkEnd w:id="40"/>

</xml_diff>